<commit_message>
Updated some stuff on creatDDL.sql and made the report for HW6
</commit_message>
<xml_diff>
--- a/requirements_and_reports/report4.docx
+++ b/requirements_and_reports/report4.docx
@@ -22,7 +22,583 @@
         <w:t>Some results of the spot reservation</w:t>
       </w:r>
     </w:p>
-    <w:p/>
+    <w:p>
+      <w:pPr>
+        <w:pStyle w:val="ListParagraph"/>
+        <w:numPr>
+          <w:ilvl w:val="0"/>
+          <w:numId w:val="1"/>
+        </w:numPr>
+      </w:pPr>
+      <w:r>
+        <w:t>Check 1: Testing Permit Issuance</w:t>
+      </w:r>
+    </w:p>
+    <w:p>
+      <w:pPr>
+        <w:pStyle w:val="ListParagraph"/>
+        <w:numPr>
+          <w:ilvl w:val="0"/>
+          <w:numId w:val="4"/>
+        </w:numPr>
+      </w:pPr>
+      <w:r>
+        <w:drawing>
+          <wp:inline distT="0" distB="0" distL="0" distR="0" wp14:anchorId="4E9301CD" wp14:editId="1471DE07">
+            <wp:extent cx="5943600" cy="3509645"/>
+            <wp:effectExtent l="0" t="0" r="0" b="0"/>
+            <wp:docPr id="601431200" name="Picture 1"/>
+            <wp:cNvGraphicFramePr>
+              <a:graphicFrameLocks xmlns:a="http://schemas.openxmlformats.org/drawingml/2006/main" noChangeAspect="1"/>
+            </wp:cNvGraphicFramePr>
+            <a:graphic xmlns:a="http://schemas.openxmlformats.org/drawingml/2006/main">
+              <a:graphicData uri="http://schemas.openxmlformats.org/drawingml/2006/picture">
+                <pic:pic xmlns:pic="http://schemas.openxmlformats.org/drawingml/2006/picture">
+                  <pic:nvPicPr>
+                    <pic:cNvPr id="601431200" name=""/>
+                    <pic:cNvPicPr/>
+                  </pic:nvPicPr>
+                  <pic:blipFill>
+                    <a:blip r:embed="rId5"/>
+                    <a:stretch>
+                      <a:fillRect/>
+                    </a:stretch>
+                  </pic:blipFill>
+                  <pic:spPr>
+                    <a:xfrm>
+                      <a:off x="0" y="0"/>
+                      <a:ext cx="5943600" cy="3509645"/>
+                    </a:xfrm>
+                    <a:prstGeom prst="rect">
+                      <a:avLst/>
+                    </a:prstGeom>
+                  </pic:spPr>
+                </pic:pic>
+              </a:graphicData>
+            </a:graphic>
+          </wp:inline>
+        </w:drawing>
+      </w:r>
+    </w:p>
+    <w:p>
+      <w:pPr>
+        <w:pStyle w:val="ListParagraph"/>
+        <w:numPr>
+          <w:ilvl w:val="0"/>
+          <w:numId w:val="1"/>
+        </w:numPr>
+      </w:pPr>
+      <w:r>
+        <w:t xml:space="preserve">Check 2: Testing </w:t>
+      </w:r>
+      <w:r>
+        <w:t>to see if a parking spot changes from available to occupied when user parks vehicle</w:t>
+      </w:r>
+      <w:r>
+        <w:t xml:space="preserve">. (NOTE: I’m testing with </w:t>
+      </w:r>
+      <w:proofErr w:type="spellStart"/>
+      <w:r>
+        <w:t>spot_id</w:t>
+      </w:r>
+      <w:proofErr w:type="spellEnd"/>
+      <w:r>
+        <w:t xml:space="preserve"> #5, look for a </w:t>
+      </w:r>
+      <w:proofErr w:type="spellStart"/>
+      <w:r>
+        <w:t>spot_id</w:t>
+      </w:r>
+      <w:proofErr w:type="spellEnd"/>
+      <w:r>
+        <w:t xml:space="preserve"> that is “Available” unless it won’t work as expected)</w:t>
+      </w:r>
+    </w:p>
+    <w:p>
+      <w:pPr>
+        <w:pStyle w:val="ListParagraph"/>
+        <w:numPr>
+          <w:ilvl w:val="0"/>
+          <w:numId w:val="4"/>
+        </w:numPr>
+      </w:pPr>
+      <w:r>
+        <w:t>Before</w:t>
+      </w:r>
+      <w:r>
+        <w:rPr>
+          <w:noProof/>
+        </w:rPr>
+        <w:t xml:space="preserve"> </w:t>
+      </w:r>
+      <w:r>
+        <w:rPr>
+          <w:noProof/>
+        </w:rPr>
+        <w:drawing>
+          <wp:inline distT="0" distB="0" distL="0" distR="0" wp14:anchorId="5A45CE9E" wp14:editId="7C4D56AA">
+            <wp:extent cx="4763838" cy="2759056"/>
+            <wp:effectExtent l="0" t="0" r="0" b="3810"/>
+            <wp:docPr id="968920488" name="Picture 1"/>
+            <wp:cNvGraphicFramePr>
+              <a:graphicFrameLocks xmlns:a="http://schemas.openxmlformats.org/drawingml/2006/main" noChangeAspect="1"/>
+            </wp:cNvGraphicFramePr>
+            <a:graphic xmlns:a="http://schemas.openxmlformats.org/drawingml/2006/main">
+              <a:graphicData uri="http://schemas.openxmlformats.org/drawingml/2006/picture">
+                <pic:pic xmlns:pic="http://schemas.openxmlformats.org/drawingml/2006/picture">
+                  <pic:nvPicPr>
+                    <pic:cNvPr id="968920488" name=""/>
+                    <pic:cNvPicPr/>
+                  </pic:nvPicPr>
+                  <pic:blipFill>
+                    <a:blip r:embed="rId6"/>
+                    <a:stretch>
+                      <a:fillRect/>
+                    </a:stretch>
+                  </pic:blipFill>
+                  <pic:spPr>
+                    <a:xfrm>
+                      <a:off x="0" y="0"/>
+                      <a:ext cx="4775324" cy="2765708"/>
+                    </a:xfrm>
+                    <a:prstGeom prst="rect">
+                      <a:avLst/>
+                    </a:prstGeom>
+                  </pic:spPr>
+                </pic:pic>
+              </a:graphicData>
+            </a:graphic>
+          </wp:inline>
+        </w:drawing>
+      </w:r>
+    </w:p>
+    <w:p>
+      <w:pPr>
+        <w:pStyle w:val="ListParagraph"/>
+        <w:numPr>
+          <w:ilvl w:val="0"/>
+          <w:numId w:val="4"/>
+        </w:numPr>
+      </w:pPr>
+      <w:r>
+        <w:rPr>
+          <w:noProof/>
+        </w:rPr>
+        <w:lastRenderedPageBreak/>
+        <w:t>After</w:t>
+      </w:r>
+      <w:r>
+        <w:rPr>
+          <w:noProof/>
+        </w:rPr>
+        <w:t xml:space="preserve"> </w:t>
+      </w:r>
+      <w:r>
+        <w:rPr>
+          <w:noProof/>
+        </w:rPr>
+        <w:drawing>
+          <wp:inline distT="0" distB="0" distL="0" distR="0" wp14:anchorId="291D88A3" wp14:editId="175CB241">
+            <wp:extent cx="5943600" cy="2592705"/>
+            <wp:effectExtent l="0" t="0" r="0" b="0"/>
+            <wp:docPr id="1648606669" name="Picture 1"/>
+            <wp:cNvGraphicFramePr>
+              <a:graphicFrameLocks xmlns:a="http://schemas.openxmlformats.org/drawingml/2006/main" noChangeAspect="1"/>
+            </wp:cNvGraphicFramePr>
+            <a:graphic xmlns:a="http://schemas.openxmlformats.org/drawingml/2006/main">
+              <a:graphicData uri="http://schemas.openxmlformats.org/drawingml/2006/picture">
+                <pic:pic xmlns:pic="http://schemas.openxmlformats.org/drawingml/2006/picture">
+                  <pic:nvPicPr>
+                    <pic:cNvPr id="1648606669" name=""/>
+                    <pic:cNvPicPr/>
+                  </pic:nvPicPr>
+                  <pic:blipFill>
+                    <a:blip r:embed="rId7"/>
+                    <a:stretch>
+                      <a:fillRect/>
+                    </a:stretch>
+                  </pic:blipFill>
+                  <pic:spPr>
+                    <a:xfrm>
+                      <a:off x="0" y="0"/>
+                      <a:ext cx="5943600" cy="2592705"/>
+                    </a:xfrm>
+                    <a:prstGeom prst="rect">
+                      <a:avLst/>
+                    </a:prstGeom>
+                  </pic:spPr>
+                </pic:pic>
+              </a:graphicData>
+            </a:graphic>
+          </wp:inline>
+        </w:drawing>
+      </w:r>
+    </w:p>
+    <w:p>
+      <w:pPr>
+        <w:pStyle w:val="ListParagraph"/>
+        <w:numPr>
+          <w:ilvl w:val="0"/>
+          <w:numId w:val="1"/>
+        </w:numPr>
+      </w:pPr>
+      <w:r>
+        <w:t xml:space="preserve">Check 3: Testing for </w:t>
+      </w:r>
+      <w:r>
+        <w:t>violations and sending tickets</w:t>
+      </w:r>
+    </w:p>
+    <w:p>
+      <w:pPr>
+        <w:pStyle w:val="ListParagraph"/>
+        <w:numPr>
+          <w:ilvl w:val="0"/>
+          <w:numId w:val="4"/>
+        </w:numPr>
+      </w:pPr>
+      <w:r>
+        <w:t xml:space="preserve">We need reservation to be expired but spot </w:t>
+      </w:r>
+      <w:proofErr w:type="gramStart"/>
+      <w:r>
+        <w:t>still</w:t>
+      </w:r>
+      <w:proofErr w:type="gramEnd"/>
+      <w:r>
+        <w:t xml:space="preserve"> occupied. Since we already occupied spot 5 in the above example, we won’t need to reoccupy it, but we will use that parking </w:t>
+      </w:r>
+      <w:proofErr w:type="gramStart"/>
+      <w:r>
+        <w:t>spot</w:t>
+      </w:r>
+      <w:proofErr w:type="gramEnd"/>
+      <w:r>
+        <w:t>.</w:t>
+      </w:r>
+    </w:p>
+    <w:p>
+      <w:pPr>
+        <w:pStyle w:val="ListParagraph"/>
+        <w:numPr>
+          <w:ilvl w:val="0"/>
+          <w:numId w:val="4"/>
+        </w:numPr>
+      </w:pPr>
+      <w:r>
+        <w:t xml:space="preserve">NOTE: I’ve updated some information for </w:t>
+      </w:r>
+      <w:proofErr w:type="gramStart"/>
+      <w:r>
+        <w:t>my</w:t>
+      </w:r>
+      <w:proofErr w:type="gramEnd"/>
+      <w:r>
+        <w:t xml:space="preserve"> </w:t>
+      </w:r>
+      <w:proofErr w:type="spellStart"/>
+      <w:r>
+        <w:t>generate_</w:t>
+      </w:r>
+      <w:proofErr w:type="gramStart"/>
+      <w:r>
+        <w:t>tickets</w:t>
+      </w:r>
+      <w:proofErr w:type="spellEnd"/>
+      <w:r>
+        <w:t>(</w:t>
+      </w:r>
+      <w:proofErr w:type="gramEnd"/>
+      <w:r>
+        <w:t>) function</w:t>
+      </w:r>
+    </w:p>
+    <w:p>
+      <w:pPr>
+        <w:pStyle w:val="ListParagraph"/>
+        <w:numPr>
+          <w:ilvl w:val="0"/>
+          <w:numId w:val="4"/>
+        </w:numPr>
+      </w:pPr>
+      <w:r>
+        <w:drawing>
+          <wp:inline distT="0" distB="0" distL="0" distR="0" wp14:anchorId="78B78DC1" wp14:editId="4DBB335A">
+            <wp:extent cx="5943600" cy="3644265"/>
+            <wp:effectExtent l="0" t="0" r="0" b="0"/>
+            <wp:docPr id="1399359130" name="Picture 1"/>
+            <wp:cNvGraphicFramePr>
+              <a:graphicFrameLocks xmlns:a="http://schemas.openxmlformats.org/drawingml/2006/main" noChangeAspect="1"/>
+            </wp:cNvGraphicFramePr>
+            <a:graphic xmlns:a="http://schemas.openxmlformats.org/drawingml/2006/main">
+              <a:graphicData uri="http://schemas.openxmlformats.org/drawingml/2006/picture">
+                <pic:pic xmlns:pic="http://schemas.openxmlformats.org/drawingml/2006/picture">
+                  <pic:nvPicPr>
+                    <pic:cNvPr id="1399359130" name=""/>
+                    <pic:cNvPicPr/>
+                  </pic:nvPicPr>
+                  <pic:blipFill>
+                    <a:blip r:embed="rId8"/>
+                    <a:stretch>
+                      <a:fillRect/>
+                    </a:stretch>
+                  </pic:blipFill>
+                  <pic:spPr>
+                    <a:xfrm>
+                      <a:off x="0" y="0"/>
+                      <a:ext cx="5943600" cy="3644265"/>
+                    </a:xfrm>
+                    <a:prstGeom prst="rect">
+                      <a:avLst/>
+                    </a:prstGeom>
+                  </pic:spPr>
+                </pic:pic>
+              </a:graphicData>
+            </a:graphic>
+          </wp:inline>
+        </w:drawing>
+      </w:r>
+    </w:p>
+    <w:p>
+      <w:pPr>
+        <w:pStyle w:val="ListParagraph"/>
+        <w:numPr>
+          <w:ilvl w:val="0"/>
+          <w:numId w:val="4"/>
+        </w:numPr>
+      </w:pPr>
+      <w:r>
+        <w:lastRenderedPageBreak/>
+        <w:drawing>
+          <wp:inline distT="0" distB="0" distL="0" distR="0" wp14:anchorId="545EBBF8" wp14:editId="4818BCD9">
+            <wp:extent cx="4123985" cy="1972552"/>
+            <wp:effectExtent l="0" t="0" r="0" b="8890"/>
+            <wp:docPr id="557504320" name="Picture 1"/>
+            <wp:cNvGraphicFramePr>
+              <a:graphicFrameLocks xmlns:a="http://schemas.openxmlformats.org/drawingml/2006/main" noChangeAspect="1"/>
+            </wp:cNvGraphicFramePr>
+            <a:graphic xmlns:a="http://schemas.openxmlformats.org/drawingml/2006/main">
+              <a:graphicData uri="http://schemas.openxmlformats.org/drawingml/2006/picture">
+                <pic:pic xmlns:pic="http://schemas.openxmlformats.org/drawingml/2006/picture">
+                  <pic:nvPicPr>
+                    <pic:cNvPr id="557504320" name=""/>
+                    <pic:cNvPicPr/>
+                  </pic:nvPicPr>
+                  <pic:blipFill>
+                    <a:blip r:embed="rId9"/>
+                    <a:stretch>
+                      <a:fillRect/>
+                    </a:stretch>
+                  </pic:blipFill>
+                  <pic:spPr>
+                    <a:xfrm>
+                      <a:off x="0" y="0"/>
+                      <a:ext cx="4149172" cy="1984599"/>
+                    </a:xfrm>
+                    <a:prstGeom prst="rect">
+                      <a:avLst/>
+                    </a:prstGeom>
+                  </pic:spPr>
+                </pic:pic>
+              </a:graphicData>
+            </a:graphic>
+          </wp:inline>
+        </w:drawing>
+      </w:r>
+      <w:r>
+        <w:t xml:space="preserve"> More clear ticket</w:t>
+      </w:r>
+    </w:p>
+    <w:p>
+      <w:pPr>
+        <w:pStyle w:val="ListParagraph"/>
+        <w:numPr>
+          <w:ilvl w:val="0"/>
+          <w:numId w:val="1"/>
+        </w:numPr>
+      </w:pPr>
+      <w:r>
+        <w:t>Check 4: Concurrency Control. Multiple transactions at the same time</w:t>
+      </w:r>
+    </w:p>
+    <w:p>
+      <w:pPr>
+        <w:pStyle w:val="ListParagraph"/>
+        <w:numPr>
+          <w:ilvl w:val="0"/>
+          <w:numId w:val="4"/>
+        </w:numPr>
+      </w:pPr>
+      <w:r>
+        <w:t>Using Locks, we’ll show how it’s impossible for 2 people to book the same parking spot at the same time</w:t>
+      </w:r>
+    </w:p>
+    <w:p>
+      <w:pPr>
+        <w:pStyle w:val="ListParagraph"/>
+        <w:numPr>
+          <w:ilvl w:val="0"/>
+          <w:numId w:val="4"/>
+        </w:numPr>
+      </w:pPr>
+      <w:r>
+        <w:t xml:space="preserve"> Session A:</w:t>
+      </w:r>
+      <w:r>
+        <w:rPr>
+          <w:noProof/>
+        </w:rPr>
+        <w:t xml:space="preserve"> </w:t>
+      </w:r>
+      <w:r>
+        <w:rPr>
+          <w:noProof/>
+        </w:rPr>
+        <w:drawing>
+          <wp:inline distT="0" distB="0" distL="0" distR="0" wp14:anchorId="07DE9AC7" wp14:editId="3D6DC875">
+            <wp:extent cx="4972966" cy="2014689"/>
+            <wp:effectExtent l="0" t="0" r="0" b="5080"/>
+            <wp:docPr id="1288583663" name="Picture 1"/>
+            <wp:cNvGraphicFramePr>
+              <a:graphicFrameLocks xmlns:a="http://schemas.openxmlformats.org/drawingml/2006/main" noChangeAspect="1"/>
+            </wp:cNvGraphicFramePr>
+            <a:graphic xmlns:a="http://schemas.openxmlformats.org/drawingml/2006/main">
+              <a:graphicData uri="http://schemas.openxmlformats.org/drawingml/2006/picture">
+                <pic:pic xmlns:pic="http://schemas.openxmlformats.org/drawingml/2006/picture">
+                  <pic:nvPicPr>
+                    <pic:cNvPr id="1288583663" name=""/>
+                    <pic:cNvPicPr/>
+                  </pic:nvPicPr>
+                  <pic:blipFill>
+                    <a:blip r:embed="rId10"/>
+                    <a:stretch>
+                      <a:fillRect/>
+                    </a:stretch>
+                  </pic:blipFill>
+                  <pic:spPr>
+                    <a:xfrm>
+                      <a:off x="0" y="0"/>
+                      <a:ext cx="4985738" cy="2019863"/>
+                    </a:xfrm>
+                    <a:prstGeom prst="rect">
+                      <a:avLst/>
+                    </a:prstGeom>
+                  </pic:spPr>
+                </pic:pic>
+              </a:graphicData>
+            </a:graphic>
+          </wp:inline>
+        </w:drawing>
+      </w:r>
+    </w:p>
+    <w:p>
+      <w:pPr>
+        <w:pStyle w:val="ListParagraph"/>
+        <w:numPr>
+          <w:ilvl w:val="0"/>
+          <w:numId w:val="4"/>
+        </w:numPr>
+      </w:pPr>
+      <w:r>
+        <w:rPr>
+          <w:noProof/>
+        </w:rPr>
+        <w:t>Session B:</w:t>
+      </w:r>
+      <w:r>
+        <w:rPr>
+          <w:noProof/>
+        </w:rPr>
+        <w:t xml:space="preserve"> </w:t>
+      </w:r>
+      <w:r>
+        <w:rPr>
+          <w:noProof/>
+        </w:rPr>
+        <w:drawing>
+          <wp:inline distT="0" distB="0" distL="0" distR="0" wp14:anchorId="6AA384DA" wp14:editId="39B9DAF5">
+            <wp:extent cx="5943600" cy="2412365"/>
+            <wp:effectExtent l="0" t="0" r="0" b="6985"/>
+            <wp:docPr id="1850459105" name="Picture 1"/>
+            <wp:cNvGraphicFramePr>
+              <a:graphicFrameLocks xmlns:a="http://schemas.openxmlformats.org/drawingml/2006/main" noChangeAspect="1"/>
+            </wp:cNvGraphicFramePr>
+            <a:graphic xmlns:a="http://schemas.openxmlformats.org/drawingml/2006/main">
+              <a:graphicData uri="http://schemas.openxmlformats.org/drawingml/2006/picture">
+                <pic:pic xmlns:pic="http://schemas.openxmlformats.org/drawingml/2006/picture">
+                  <pic:nvPicPr>
+                    <pic:cNvPr id="1850459105" name=""/>
+                    <pic:cNvPicPr/>
+                  </pic:nvPicPr>
+                  <pic:blipFill>
+                    <a:blip r:embed="rId11"/>
+                    <a:stretch>
+                      <a:fillRect/>
+                    </a:stretch>
+                  </pic:blipFill>
+                  <pic:spPr>
+                    <a:xfrm>
+                      <a:off x="0" y="0"/>
+                      <a:ext cx="5943600" cy="2412365"/>
+                    </a:xfrm>
+                    <a:prstGeom prst="rect">
+                      <a:avLst/>
+                    </a:prstGeom>
+                  </pic:spPr>
+                </pic:pic>
+              </a:graphicData>
+            </a:graphic>
+          </wp:inline>
+        </w:drawing>
+      </w:r>
+    </w:p>
+    <w:p>
+      <w:pPr>
+        <w:pStyle w:val="ListParagraph"/>
+        <w:numPr>
+          <w:ilvl w:val="0"/>
+          <w:numId w:val="4"/>
+        </w:numPr>
+      </w:pPr>
+      <w:r>
+        <w:lastRenderedPageBreak/>
+        <w:drawing>
+          <wp:inline distT="0" distB="0" distL="0" distR="0" wp14:anchorId="1110DBB3" wp14:editId="707E92BB">
+            <wp:extent cx="5943600" cy="2067560"/>
+            <wp:effectExtent l="0" t="0" r="0" b="8890"/>
+            <wp:docPr id="1614783984" name="Picture 1"/>
+            <wp:cNvGraphicFramePr>
+              <a:graphicFrameLocks xmlns:a="http://schemas.openxmlformats.org/drawingml/2006/main" noChangeAspect="1"/>
+            </wp:cNvGraphicFramePr>
+            <a:graphic xmlns:a="http://schemas.openxmlformats.org/drawingml/2006/main">
+              <a:graphicData uri="http://schemas.openxmlformats.org/drawingml/2006/picture">
+                <pic:pic xmlns:pic="http://schemas.openxmlformats.org/drawingml/2006/picture">
+                  <pic:nvPicPr>
+                    <pic:cNvPr id="1614783984" name=""/>
+                    <pic:cNvPicPr/>
+                  </pic:nvPicPr>
+                  <pic:blipFill>
+                    <a:blip r:embed="rId12"/>
+                    <a:stretch>
+                      <a:fillRect/>
+                    </a:stretch>
+                  </pic:blipFill>
+                  <pic:spPr>
+                    <a:xfrm>
+                      <a:off x="0" y="0"/>
+                      <a:ext cx="5943600" cy="2067560"/>
+                    </a:xfrm>
+                    <a:prstGeom prst="rect">
+                      <a:avLst/>
+                    </a:prstGeom>
+                  </pic:spPr>
+                </pic:pic>
+              </a:graphicData>
+            </a:graphic>
+          </wp:inline>
+        </w:drawing>
+      </w:r>
+    </w:p>
     <w:p/>
     <w:sectPr>
       <w:pgSz w:w="12240" w:h="15840"/>
@@ -32,6 +608,452 @@
     </w:sectPr>
   </w:body>
 </w:document>
+</file>
+
+<file path=word/numbering.xml><?xml version="1.0" encoding="utf-8"?>
+<w:numbering xmlns:wpc="http://schemas.microsoft.com/office/word/2010/wordprocessingCanvas" xmlns:cx="http://schemas.microsoft.com/office/drawing/2014/chartex" xmlns:cx1="http://schemas.microsoft.com/office/drawing/2015/9/8/chartex" xmlns:cx2="http://schemas.microsoft.com/office/drawing/2015/10/21/chartex" xmlns:cx3="http://schemas.microsoft.com/office/drawing/2016/5/9/chartex" xmlns:cx4="http://schemas.microsoft.com/office/drawing/2016/5/10/chartex" xmlns:cx5="http://schemas.microsoft.com/office/drawing/2016/5/11/chartex" xmlns:cx6="http://schemas.microsoft.com/office/drawing/2016/5/12/chartex" xmlns:cx7="http://schemas.microsoft.com/office/drawing/2016/5/13/chartex" xmlns:cx8="http://schemas.microsoft.com/office/drawing/2016/5/14/chartex" xmlns:mc="http://schemas.openxmlformats.org/markup-compatibility/2006" xmlns:aink="http://schemas.microsoft.com/office/drawing/2016/ink" xmlns:am3d="http://schemas.microsoft.com/office/drawing/2017/model3d" xmlns:o="urn:schemas-microsoft-com:office:office" xmlns:oel="http://schemas.microsoft.com/office/2019/extlst" xmlns:r="http://schemas.openxmlformats.org/officeDocument/2006/relationships" xmlns:m="http://schemas.openxmlformats.org/officeDocument/2006/math" xmlns:v="urn:schemas-microsoft-com:vml" xmlns:wp14="http://schemas.microsoft.com/office/word/2010/wordprocessingDrawing" xmlns:wp="http://schemas.openxmlformats.org/drawingml/2006/wordprocessingDrawing" xmlns:w10="urn:schemas-microsoft-com:office:word" xmlns:w="http://schemas.openxmlformats.org/wordprocessingml/2006/main" xmlns:w14="http://schemas.microsoft.com/office/word/2010/wordml" xmlns:w15="http://schemas.microsoft.com/office/word/2012/wordml" xmlns:w16cex="http://schemas.microsoft.com/office/word/2018/wordml/cex" xmlns:w16cid="http://schemas.microsoft.com/office/word/2016/wordml/cid" xmlns:w16="http://schemas.microsoft.com/office/word/2018/wordml" xmlns:w16du="http://schemas.microsoft.com/office/word/2023/wordml/word16du" xmlns:w16sdtdh="http://schemas.microsoft.com/office/word/2020/wordml/sdtdatahash" xmlns:w16sdtfl="http://schemas.microsoft.com/office/word/2024/wordml/sdtformatlock" xmlns:w16se="http://schemas.microsoft.com/office/word/2015/wordml/symex" xmlns:wpg="http://schemas.microsoft.com/office/word/2010/wordprocessingGroup" xmlns:wpi="http://schemas.microsoft.com/office/word/2010/wordprocessingInk" xmlns:wne="http://schemas.microsoft.com/office/word/2006/wordml" xmlns:wps="http://schemas.microsoft.com/office/word/2010/wordprocessingShape" mc:Ignorable="w14 w15 w16se w16cid w16 w16cex w16sdtdh w16sdtfl w16du wp14">
+  <w:abstractNum w:abstractNumId="0" w15:restartNumberingAfterBreak="0">
+    <w:nsid w:val="04CA6A79"/>
+    <w:multiLevelType w:val="hybridMultilevel"/>
+    <w:tmpl w:val="968C1BF2"/>
+    <w:lvl w:ilvl="0" w:tplc="9DCAFD86">
+      <w:start w:val="1"/>
+      <w:numFmt w:val="bullet"/>
+      <w:lvlText w:val="-"/>
+      <w:lvlJc w:val="left"/>
+      <w:pPr>
+        <w:ind w:left="1080" w:hanging="360"/>
+      </w:pPr>
+      <w:rPr>
+        <w:rFonts w:ascii="Aptos" w:eastAsiaTheme="minorHAnsi" w:hAnsi="Aptos" w:cstheme="minorBidi" w:hint="default"/>
+      </w:rPr>
+    </w:lvl>
+    <w:lvl w:ilvl="1" w:tplc="04090003" w:tentative="1">
+      <w:start w:val="1"/>
+      <w:numFmt w:val="bullet"/>
+      <w:lvlText w:val="o"/>
+      <w:lvlJc w:val="left"/>
+      <w:pPr>
+        <w:ind w:left="1800" w:hanging="360"/>
+      </w:pPr>
+      <w:rPr>
+        <w:rFonts w:ascii="Courier New" w:hAnsi="Courier New" w:cs="Courier New" w:hint="default"/>
+      </w:rPr>
+    </w:lvl>
+    <w:lvl w:ilvl="2" w:tplc="04090005" w:tentative="1">
+      <w:start w:val="1"/>
+      <w:numFmt w:val="bullet"/>
+      <w:lvlText w:val=""/>
+      <w:lvlJc w:val="left"/>
+      <w:pPr>
+        <w:ind w:left="2520" w:hanging="360"/>
+      </w:pPr>
+      <w:rPr>
+        <w:rFonts w:ascii="Wingdings" w:hAnsi="Wingdings" w:hint="default"/>
+      </w:rPr>
+    </w:lvl>
+    <w:lvl w:ilvl="3" w:tplc="04090001" w:tentative="1">
+      <w:start w:val="1"/>
+      <w:numFmt w:val="bullet"/>
+      <w:lvlText w:val=""/>
+      <w:lvlJc w:val="left"/>
+      <w:pPr>
+        <w:ind w:left="3240" w:hanging="360"/>
+      </w:pPr>
+      <w:rPr>
+        <w:rFonts w:ascii="Symbol" w:hAnsi="Symbol" w:hint="default"/>
+      </w:rPr>
+    </w:lvl>
+    <w:lvl w:ilvl="4" w:tplc="04090003" w:tentative="1">
+      <w:start w:val="1"/>
+      <w:numFmt w:val="bullet"/>
+      <w:lvlText w:val="o"/>
+      <w:lvlJc w:val="left"/>
+      <w:pPr>
+        <w:ind w:left="3960" w:hanging="360"/>
+      </w:pPr>
+      <w:rPr>
+        <w:rFonts w:ascii="Courier New" w:hAnsi="Courier New" w:cs="Courier New" w:hint="default"/>
+      </w:rPr>
+    </w:lvl>
+    <w:lvl w:ilvl="5" w:tplc="04090005" w:tentative="1">
+      <w:start w:val="1"/>
+      <w:numFmt w:val="bullet"/>
+      <w:lvlText w:val=""/>
+      <w:lvlJc w:val="left"/>
+      <w:pPr>
+        <w:ind w:left="4680" w:hanging="360"/>
+      </w:pPr>
+      <w:rPr>
+        <w:rFonts w:ascii="Wingdings" w:hAnsi="Wingdings" w:hint="default"/>
+      </w:rPr>
+    </w:lvl>
+    <w:lvl w:ilvl="6" w:tplc="04090001" w:tentative="1">
+      <w:start w:val="1"/>
+      <w:numFmt w:val="bullet"/>
+      <w:lvlText w:val=""/>
+      <w:lvlJc w:val="left"/>
+      <w:pPr>
+        <w:ind w:left="5400" w:hanging="360"/>
+      </w:pPr>
+      <w:rPr>
+        <w:rFonts w:ascii="Symbol" w:hAnsi="Symbol" w:hint="default"/>
+      </w:rPr>
+    </w:lvl>
+    <w:lvl w:ilvl="7" w:tplc="04090003" w:tentative="1">
+      <w:start w:val="1"/>
+      <w:numFmt w:val="bullet"/>
+      <w:lvlText w:val="o"/>
+      <w:lvlJc w:val="left"/>
+      <w:pPr>
+        <w:ind w:left="6120" w:hanging="360"/>
+      </w:pPr>
+      <w:rPr>
+        <w:rFonts w:ascii="Courier New" w:hAnsi="Courier New" w:cs="Courier New" w:hint="default"/>
+      </w:rPr>
+    </w:lvl>
+    <w:lvl w:ilvl="8" w:tplc="04090005" w:tentative="1">
+      <w:start w:val="1"/>
+      <w:numFmt w:val="bullet"/>
+      <w:lvlText w:val=""/>
+      <w:lvlJc w:val="left"/>
+      <w:pPr>
+        <w:ind w:left="6840" w:hanging="360"/>
+      </w:pPr>
+      <w:rPr>
+        <w:rFonts w:ascii="Wingdings" w:hAnsi="Wingdings" w:hint="default"/>
+      </w:rPr>
+    </w:lvl>
+  </w:abstractNum>
+  <w:abstractNum w:abstractNumId="1" w15:restartNumberingAfterBreak="0">
+    <w:nsid w:val="3430420B"/>
+    <w:multiLevelType w:val="hybridMultilevel"/>
+    <w:tmpl w:val="B3A8B3A4"/>
+    <w:lvl w:ilvl="0" w:tplc="35DA4B2E">
+      <w:start w:val="1"/>
+      <w:numFmt w:val="bullet"/>
+      <w:lvlText w:val="-"/>
+      <w:lvlJc w:val="left"/>
+      <w:pPr>
+        <w:ind w:left="1440" w:hanging="360"/>
+      </w:pPr>
+      <w:rPr>
+        <w:rFonts w:ascii="Aptos" w:eastAsiaTheme="minorHAnsi" w:hAnsi="Aptos" w:cstheme="minorBidi" w:hint="default"/>
+      </w:rPr>
+    </w:lvl>
+    <w:lvl w:ilvl="1" w:tplc="04090003" w:tentative="1">
+      <w:start w:val="1"/>
+      <w:numFmt w:val="bullet"/>
+      <w:lvlText w:val="o"/>
+      <w:lvlJc w:val="left"/>
+      <w:pPr>
+        <w:ind w:left="2160" w:hanging="360"/>
+      </w:pPr>
+      <w:rPr>
+        <w:rFonts w:ascii="Courier New" w:hAnsi="Courier New" w:cs="Courier New" w:hint="default"/>
+      </w:rPr>
+    </w:lvl>
+    <w:lvl w:ilvl="2" w:tplc="04090005" w:tentative="1">
+      <w:start w:val="1"/>
+      <w:numFmt w:val="bullet"/>
+      <w:lvlText w:val=""/>
+      <w:lvlJc w:val="left"/>
+      <w:pPr>
+        <w:ind w:left="2880" w:hanging="360"/>
+      </w:pPr>
+      <w:rPr>
+        <w:rFonts w:ascii="Wingdings" w:hAnsi="Wingdings" w:hint="default"/>
+      </w:rPr>
+    </w:lvl>
+    <w:lvl w:ilvl="3" w:tplc="04090001" w:tentative="1">
+      <w:start w:val="1"/>
+      <w:numFmt w:val="bullet"/>
+      <w:lvlText w:val=""/>
+      <w:lvlJc w:val="left"/>
+      <w:pPr>
+        <w:ind w:left="3600" w:hanging="360"/>
+      </w:pPr>
+      <w:rPr>
+        <w:rFonts w:ascii="Symbol" w:hAnsi="Symbol" w:hint="default"/>
+      </w:rPr>
+    </w:lvl>
+    <w:lvl w:ilvl="4" w:tplc="04090003" w:tentative="1">
+      <w:start w:val="1"/>
+      <w:numFmt w:val="bullet"/>
+      <w:lvlText w:val="o"/>
+      <w:lvlJc w:val="left"/>
+      <w:pPr>
+        <w:ind w:left="4320" w:hanging="360"/>
+      </w:pPr>
+      <w:rPr>
+        <w:rFonts w:ascii="Courier New" w:hAnsi="Courier New" w:cs="Courier New" w:hint="default"/>
+      </w:rPr>
+    </w:lvl>
+    <w:lvl w:ilvl="5" w:tplc="04090005" w:tentative="1">
+      <w:start w:val="1"/>
+      <w:numFmt w:val="bullet"/>
+      <w:lvlText w:val=""/>
+      <w:lvlJc w:val="left"/>
+      <w:pPr>
+        <w:ind w:left="5040" w:hanging="360"/>
+      </w:pPr>
+      <w:rPr>
+        <w:rFonts w:ascii="Wingdings" w:hAnsi="Wingdings" w:hint="default"/>
+      </w:rPr>
+    </w:lvl>
+    <w:lvl w:ilvl="6" w:tplc="04090001" w:tentative="1">
+      <w:start w:val="1"/>
+      <w:numFmt w:val="bullet"/>
+      <w:lvlText w:val=""/>
+      <w:lvlJc w:val="left"/>
+      <w:pPr>
+        <w:ind w:left="5760" w:hanging="360"/>
+      </w:pPr>
+      <w:rPr>
+        <w:rFonts w:ascii="Symbol" w:hAnsi="Symbol" w:hint="default"/>
+      </w:rPr>
+    </w:lvl>
+    <w:lvl w:ilvl="7" w:tplc="04090003" w:tentative="1">
+      <w:start w:val="1"/>
+      <w:numFmt w:val="bullet"/>
+      <w:lvlText w:val="o"/>
+      <w:lvlJc w:val="left"/>
+      <w:pPr>
+        <w:ind w:left="6480" w:hanging="360"/>
+      </w:pPr>
+      <w:rPr>
+        <w:rFonts w:ascii="Courier New" w:hAnsi="Courier New" w:cs="Courier New" w:hint="default"/>
+      </w:rPr>
+    </w:lvl>
+    <w:lvl w:ilvl="8" w:tplc="04090005" w:tentative="1">
+      <w:start w:val="1"/>
+      <w:numFmt w:val="bullet"/>
+      <w:lvlText w:val=""/>
+      <w:lvlJc w:val="left"/>
+      <w:pPr>
+        <w:ind w:left="7200" w:hanging="360"/>
+      </w:pPr>
+      <w:rPr>
+        <w:rFonts w:ascii="Wingdings" w:hAnsi="Wingdings" w:hint="default"/>
+      </w:rPr>
+    </w:lvl>
+  </w:abstractNum>
+  <w:abstractNum w:abstractNumId="2" w15:restartNumberingAfterBreak="0">
+    <w:nsid w:val="4D324CE7"/>
+    <w:multiLevelType w:val="hybridMultilevel"/>
+    <w:tmpl w:val="79042C6E"/>
+    <w:lvl w:ilvl="0" w:tplc="78CA3BDA">
+      <w:start w:val="1"/>
+      <w:numFmt w:val="bullet"/>
+      <w:lvlText w:val="-"/>
+      <w:lvlJc w:val="left"/>
+      <w:pPr>
+        <w:ind w:left="1080" w:hanging="360"/>
+      </w:pPr>
+      <w:rPr>
+        <w:rFonts w:ascii="Aptos" w:eastAsiaTheme="minorHAnsi" w:hAnsi="Aptos" w:cstheme="minorBidi" w:hint="default"/>
+        <w:sz w:val="28"/>
+      </w:rPr>
+    </w:lvl>
+    <w:lvl w:ilvl="1" w:tplc="04090003" w:tentative="1">
+      <w:start w:val="1"/>
+      <w:numFmt w:val="bullet"/>
+      <w:lvlText w:val="o"/>
+      <w:lvlJc w:val="left"/>
+      <w:pPr>
+        <w:ind w:left="1800" w:hanging="360"/>
+      </w:pPr>
+      <w:rPr>
+        <w:rFonts w:ascii="Courier New" w:hAnsi="Courier New" w:cs="Courier New" w:hint="default"/>
+      </w:rPr>
+    </w:lvl>
+    <w:lvl w:ilvl="2" w:tplc="04090005" w:tentative="1">
+      <w:start w:val="1"/>
+      <w:numFmt w:val="bullet"/>
+      <w:lvlText w:val=""/>
+      <w:lvlJc w:val="left"/>
+      <w:pPr>
+        <w:ind w:left="2520" w:hanging="360"/>
+      </w:pPr>
+      <w:rPr>
+        <w:rFonts w:ascii="Wingdings" w:hAnsi="Wingdings" w:hint="default"/>
+      </w:rPr>
+    </w:lvl>
+    <w:lvl w:ilvl="3" w:tplc="04090001" w:tentative="1">
+      <w:start w:val="1"/>
+      <w:numFmt w:val="bullet"/>
+      <w:lvlText w:val=""/>
+      <w:lvlJc w:val="left"/>
+      <w:pPr>
+        <w:ind w:left="3240" w:hanging="360"/>
+      </w:pPr>
+      <w:rPr>
+        <w:rFonts w:ascii="Symbol" w:hAnsi="Symbol" w:hint="default"/>
+      </w:rPr>
+    </w:lvl>
+    <w:lvl w:ilvl="4" w:tplc="04090003" w:tentative="1">
+      <w:start w:val="1"/>
+      <w:numFmt w:val="bullet"/>
+      <w:lvlText w:val="o"/>
+      <w:lvlJc w:val="left"/>
+      <w:pPr>
+        <w:ind w:left="3960" w:hanging="360"/>
+      </w:pPr>
+      <w:rPr>
+        <w:rFonts w:ascii="Courier New" w:hAnsi="Courier New" w:cs="Courier New" w:hint="default"/>
+      </w:rPr>
+    </w:lvl>
+    <w:lvl w:ilvl="5" w:tplc="04090005" w:tentative="1">
+      <w:start w:val="1"/>
+      <w:numFmt w:val="bullet"/>
+      <w:lvlText w:val=""/>
+      <w:lvlJc w:val="left"/>
+      <w:pPr>
+        <w:ind w:left="4680" w:hanging="360"/>
+      </w:pPr>
+      <w:rPr>
+        <w:rFonts w:ascii="Wingdings" w:hAnsi="Wingdings" w:hint="default"/>
+      </w:rPr>
+    </w:lvl>
+    <w:lvl w:ilvl="6" w:tplc="04090001" w:tentative="1">
+      <w:start w:val="1"/>
+      <w:numFmt w:val="bullet"/>
+      <w:lvlText w:val=""/>
+      <w:lvlJc w:val="left"/>
+      <w:pPr>
+        <w:ind w:left="5400" w:hanging="360"/>
+      </w:pPr>
+      <w:rPr>
+        <w:rFonts w:ascii="Symbol" w:hAnsi="Symbol" w:hint="default"/>
+      </w:rPr>
+    </w:lvl>
+    <w:lvl w:ilvl="7" w:tplc="04090003" w:tentative="1">
+      <w:start w:val="1"/>
+      <w:numFmt w:val="bullet"/>
+      <w:lvlText w:val="o"/>
+      <w:lvlJc w:val="left"/>
+      <w:pPr>
+        <w:ind w:left="6120" w:hanging="360"/>
+      </w:pPr>
+      <w:rPr>
+        <w:rFonts w:ascii="Courier New" w:hAnsi="Courier New" w:cs="Courier New" w:hint="default"/>
+      </w:rPr>
+    </w:lvl>
+    <w:lvl w:ilvl="8" w:tplc="04090005" w:tentative="1">
+      <w:start w:val="1"/>
+      <w:numFmt w:val="bullet"/>
+      <w:lvlText w:val=""/>
+      <w:lvlJc w:val="left"/>
+      <w:pPr>
+        <w:ind w:left="6840" w:hanging="360"/>
+      </w:pPr>
+      <w:rPr>
+        <w:rFonts w:ascii="Wingdings" w:hAnsi="Wingdings" w:hint="default"/>
+      </w:rPr>
+    </w:lvl>
+  </w:abstractNum>
+  <w:abstractNum w:abstractNumId="3" w15:restartNumberingAfterBreak="0">
+    <w:nsid w:val="76113033"/>
+    <w:multiLevelType w:val="hybridMultilevel"/>
+    <w:tmpl w:val="5EDC9C48"/>
+    <w:lvl w:ilvl="0" w:tplc="0409000F">
+      <w:start w:val="1"/>
+      <w:numFmt w:val="decimal"/>
+      <w:lvlText w:val="%1."/>
+      <w:lvlJc w:val="left"/>
+      <w:pPr>
+        <w:ind w:left="720" w:hanging="360"/>
+      </w:pPr>
+      <w:rPr>
+        <w:rFonts w:hint="default"/>
+      </w:rPr>
+    </w:lvl>
+    <w:lvl w:ilvl="1" w:tplc="04090019" w:tentative="1">
+      <w:start w:val="1"/>
+      <w:numFmt w:val="lowerLetter"/>
+      <w:lvlText w:val="%2."/>
+      <w:lvlJc w:val="left"/>
+      <w:pPr>
+        <w:ind w:left="1440" w:hanging="360"/>
+      </w:pPr>
+    </w:lvl>
+    <w:lvl w:ilvl="2" w:tplc="0409001B" w:tentative="1">
+      <w:start w:val="1"/>
+      <w:numFmt w:val="lowerRoman"/>
+      <w:lvlText w:val="%3."/>
+      <w:lvlJc w:val="right"/>
+      <w:pPr>
+        <w:ind w:left="2160" w:hanging="180"/>
+      </w:pPr>
+    </w:lvl>
+    <w:lvl w:ilvl="3" w:tplc="0409000F" w:tentative="1">
+      <w:start w:val="1"/>
+      <w:numFmt w:val="decimal"/>
+      <w:lvlText w:val="%4."/>
+      <w:lvlJc w:val="left"/>
+      <w:pPr>
+        <w:ind w:left="2880" w:hanging="360"/>
+      </w:pPr>
+    </w:lvl>
+    <w:lvl w:ilvl="4" w:tplc="04090019" w:tentative="1">
+      <w:start w:val="1"/>
+      <w:numFmt w:val="lowerLetter"/>
+      <w:lvlText w:val="%5."/>
+      <w:lvlJc w:val="left"/>
+      <w:pPr>
+        <w:ind w:left="3600" w:hanging="360"/>
+      </w:pPr>
+    </w:lvl>
+    <w:lvl w:ilvl="5" w:tplc="0409001B" w:tentative="1">
+      <w:start w:val="1"/>
+      <w:numFmt w:val="lowerRoman"/>
+      <w:lvlText w:val="%6."/>
+      <w:lvlJc w:val="right"/>
+      <w:pPr>
+        <w:ind w:left="4320" w:hanging="180"/>
+      </w:pPr>
+    </w:lvl>
+    <w:lvl w:ilvl="6" w:tplc="0409000F" w:tentative="1">
+      <w:start w:val="1"/>
+      <w:numFmt w:val="decimal"/>
+      <w:lvlText w:val="%7."/>
+      <w:lvlJc w:val="left"/>
+      <w:pPr>
+        <w:ind w:left="5040" w:hanging="360"/>
+      </w:pPr>
+    </w:lvl>
+    <w:lvl w:ilvl="7" w:tplc="04090019" w:tentative="1">
+      <w:start w:val="1"/>
+      <w:numFmt w:val="lowerLetter"/>
+      <w:lvlText w:val="%8."/>
+      <w:lvlJc w:val="left"/>
+      <w:pPr>
+        <w:ind w:left="5760" w:hanging="360"/>
+      </w:pPr>
+    </w:lvl>
+    <w:lvl w:ilvl="8" w:tplc="0409001B" w:tentative="1">
+      <w:start w:val="1"/>
+      <w:numFmt w:val="lowerRoman"/>
+      <w:lvlText w:val="%9."/>
+      <w:lvlJc w:val="right"/>
+      <w:pPr>
+        <w:ind w:left="6480" w:hanging="180"/>
+      </w:pPr>
+    </w:lvl>
+  </w:abstractNum>
+  <w:num w:numId="1" w16cid:durableId="894506382">
+    <w:abstractNumId w:val="3"/>
+  </w:num>
+  <w:num w:numId="2" w16cid:durableId="364595897">
+    <w:abstractNumId w:val="0"/>
+  </w:num>
+  <w:num w:numId="3" w16cid:durableId="1044864466">
+    <w:abstractNumId w:val="1"/>
+  </w:num>
+  <w:num w:numId="4" w16cid:durableId="188759749">
+    <w:abstractNumId w:val="2"/>
+  </w:num>
+</w:numbering>
 </file>
 
 <file path=word/styles.xml><?xml version="1.0" encoding="utf-8"?>

</xml_diff>

<commit_message>
just created a the file containing all the queries for HW6
</commit_message>
<xml_diff>
--- a/requirements_and_reports/report4.docx
+++ b/requirements_and_reports/report4.docx
@@ -19,6 +19,15 @@
           <w:sz w:val="30"/>
           <w:szCs w:val="30"/>
         </w:rPr>
+        <w:t xml:space="preserve">HW6: </w:t>
+      </w:r>
+      <w:r>
+        <w:rPr>
+          <w:b/>
+          <w:bCs/>
+          <w:sz w:val="30"/>
+          <w:szCs w:val="30"/>
+        </w:rPr>
         <w:t>Some results of the spot reservation</w:t>
       </w:r>
     </w:p>
@@ -43,6 +52,9 @@
         </w:numPr>
       </w:pPr>
       <w:r>
+        <w:rPr>
+          <w:noProof/>
+        </w:rPr>
         <w:drawing>
           <wp:inline distT="0" distB="0" distL="0" distR="0" wp14:anchorId="4E9301CD" wp14:editId="1471DE07">
             <wp:extent cx="5943600" cy="3509645"/>
@@ -95,23 +107,7 @@
         <w:t>to see if a parking spot changes from available to occupied when user parks vehicle</w:t>
       </w:r>
       <w:r>
-        <w:t xml:space="preserve">. (NOTE: I’m testing with </w:t>
-      </w:r>
-      <w:proofErr w:type="spellStart"/>
-      <w:r>
-        <w:t>spot_id</w:t>
-      </w:r>
-      <w:proofErr w:type="spellEnd"/>
-      <w:r>
-        <w:t xml:space="preserve"> #5, look for a </w:t>
-      </w:r>
-      <w:proofErr w:type="spellStart"/>
-      <w:r>
-        <w:t>spot_id</w:t>
-      </w:r>
-      <w:proofErr w:type="spellEnd"/>
-      <w:r>
-        <w:t xml:space="preserve"> that is “Available” unless it won’t work as expected)</w:t>
+        <w:t>. (NOTE: I’m testing with spot_id #5, look for a spot_id that is “Available” unless it won’t work as expected)</w:t>
       </w:r>
     </w:p>
     <w:p>
@@ -294,19 +290,11 @@
       </w:r>
       <w:proofErr w:type="gramEnd"/>
       <w:r>
-        <w:t xml:space="preserve"> </w:t>
-      </w:r>
-      <w:proofErr w:type="spellStart"/>
-      <w:r>
-        <w:t>generate_</w:t>
+        <w:t xml:space="preserve"> generate_</w:t>
       </w:r>
       <w:proofErr w:type="gramStart"/>
       <w:r>
-        <w:t>tickets</w:t>
-      </w:r>
-      <w:proofErr w:type="spellEnd"/>
-      <w:r>
-        <w:t>(</w:t>
+        <w:t>tickets(</w:t>
       </w:r>
       <w:proofErr w:type="gramEnd"/>
       <w:r>
@@ -322,6 +310,9 @@
         </w:numPr>
       </w:pPr>
       <w:r>
+        <w:rPr>
+          <w:noProof/>
+        </w:rPr>
         <w:drawing>
           <wp:inline distT="0" distB="0" distL="0" distR="0" wp14:anchorId="78B78DC1" wp14:editId="4DBB335A">
             <wp:extent cx="5943600" cy="3644265"/>
@@ -368,6 +359,9 @@
         </w:numPr>
       </w:pPr>
       <w:r>
+        <w:rPr>
+          <w:noProof/>
+        </w:rPr>
         <w:lastRenderedPageBreak/>
         <w:drawing>
           <wp:inline distT="0" distB="0" distL="0" distR="0" wp14:anchorId="545EBBF8" wp14:editId="4818BCD9">
@@ -561,6 +555,9 @@
         </w:numPr>
       </w:pPr>
       <w:r>
+        <w:rPr>
+          <w:noProof/>
+        </w:rPr>
         <w:lastRenderedPageBreak/>
         <w:drawing>
           <wp:inline distT="0" distB="0" distL="0" distR="0" wp14:anchorId="1110DBB3" wp14:editId="707E92BB">

</xml_diff>